<commit_message>
Added screenshots to wordFile + Screenshot Folder
</commit_message>
<xml_diff>
--- a/NS_Assignment_1.docx
+++ b/NS_Assignment_1.docx
@@ -2262,13 +2262,381 @@
     </w:p>
     <w:p>
       <w:pPr>
-        <w:spacing w:after="0"/>
-        <w:rPr>
-          <w:bCs/>
-          <w:sz w:val="28"/>
-          <w:szCs w:val="28"/>
-        </w:rPr>
-      </w:pPr>
+        <w:pStyle w:val="Heading1"/>
+      </w:pPr>
+      <w:r>
+        <w:t xml:space="preserve">2) Screen Shots </w:t>
+      </w:r>
+    </w:p>
+    <w:p>
+      <w:pPr>
+        <w:pStyle w:val="Heading2"/>
+        <w:numPr>
+          <w:ilvl w:val="0"/>
+          <w:numId w:val="17"/>
+        </w:numPr>
+      </w:pPr>
+      <w:r>
+        <w:drawing>
+          <wp:anchor distT="0" distB="0" distL="114300" distR="114300" simplePos="0" relativeHeight="251660288" behindDoc="1" locked="0" layoutInCell="1" allowOverlap="1" wp14:anchorId="6A0ABD6F" wp14:editId="35670AE8">
+            <wp:simplePos x="0" y="0"/>
+            <wp:positionH relativeFrom="margin">
+              <wp:align>right</wp:align>
+            </wp:positionH>
+            <wp:positionV relativeFrom="paragraph">
+              <wp:posOffset>320040</wp:posOffset>
+            </wp:positionV>
+            <wp:extent cx="6645910" cy="4553585"/>
+            <wp:effectExtent l="0" t="0" r="2540" b="0"/>
+            <wp:wrapTight wrapText="bothSides">
+              <wp:wrapPolygon edited="0">
+                <wp:start x="0" y="0"/>
+                <wp:lineTo x="0" y="21507"/>
+                <wp:lineTo x="21546" y="21507"/>
+                <wp:lineTo x="21546" y="0"/>
+                <wp:lineTo x="0" y="0"/>
+              </wp:wrapPolygon>
+            </wp:wrapTight>
+            <wp:docPr id="191977972" name="Picture 1"/>
+            <wp:cNvGraphicFramePr>
+              <a:graphicFrameLocks xmlns:a="http://schemas.openxmlformats.org/drawingml/2006/main" noChangeAspect="1"/>
+            </wp:cNvGraphicFramePr>
+            <a:graphic xmlns:a="http://schemas.openxmlformats.org/drawingml/2006/main">
+              <a:graphicData uri="http://schemas.openxmlformats.org/drawingml/2006/picture">
+                <pic:pic xmlns:pic="http://schemas.openxmlformats.org/drawingml/2006/picture">
+                  <pic:nvPicPr>
+                    <pic:cNvPr id="191977972" name=""/>
+                    <pic:cNvPicPr/>
+                  </pic:nvPicPr>
+                  <pic:blipFill>
+                    <a:blip r:embed="rId5">
+                      <a:extLst>
+                        <a:ext uri="{28A0092B-C50C-407E-A947-70E740481C1C}">
+                          <a14:useLocalDpi xmlns:a14="http://schemas.microsoft.com/office/drawing/2010/main" val="0"/>
+                        </a:ext>
+                      </a:extLst>
+                    </a:blip>
+                    <a:stretch>
+                      <a:fillRect/>
+                    </a:stretch>
+                  </pic:blipFill>
+                  <pic:spPr>
+                    <a:xfrm>
+                      <a:off x="0" y="0"/>
+                      <a:ext cx="6645910" cy="4553585"/>
+                    </a:xfrm>
+                    <a:prstGeom prst="rect">
+                      <a:avLst/>
+                    </a:prstGeom>
+                  </pic:spPr>
+                </pic:pic>
+              </a:graphicData>
+            </a:graphic>
+          </wp:anchor>
+        </w:drawing>
+      </w:r>
+      <w:r>
+        <w:t>Get vehicles</w:t>
+      </w:r>
+      <w:r>
+        <w:br/>
+      </w:r>
+      <w:r>
+        <w:br/>
+      </w:r>
+    </w:p>
+    <w:p/>
+    <w:p/>
+    <w:p/>
+    <w:p/>
+    <w:p/>
+    <w:p>
+      <w:pPr>
+        <w:pStyle w:val="Heading2"/>
+        <w:numPr>
+          <w:ilvl w:val="0"/>
+          <w:numId w:val="17"/>
+        </w:numPr>
+      </w:pPr>
+      <w:r>
+        <w:t xml:space="preserve">Create Vehicles </w:t>
+      </w:r>
+    </w:p>
+    <w:p>
+      <w:r>
+        <w:drawing>
+          <wp:anchor distT="0" distB="0" distL="114300" distR="114300" simplePos="0" relativeHeight="251659264" behindDoc="1" locked="0" layoutInCell="1" allowOverlap="1" wp14:anchorId="7C8D4EC9" wp14:editId="0ECFF8B5">
+            <wp:simplePos x="0" y="0"/>
+            <wp:positionH relativeFrom="column">
+              <wp:posOffset>0</wp:posOffset>
+            </wp:positionH>
+            <wp:positionV relativeFrom="paragraph">
+              <wp:posOffset>320040</wp:posOffset>
+            </wp:positionV>
+            <wp:extent cx="6645910" cy="3736975"/>
+            <wp:effectExtent l="0" t="0" r="2540" b="0"/>
+            <wp:wrapTight wrapText="bothSides">
+              <wp:wrapPolygon edited="0">
+                <wp:start x="0" y="0"/>
+                <wp:lineTo x="0" y="21472"/>
+                <wp:lineTo x="21546" y="21472"/>
+                <wp:lineTo x="21546" y="0"/>
+                <wp:lineTo x="0" y="0"/>
+              </wp:wrapPolygon>
+            </wp:wrapTight>
+            <wp:docPr id="1964029956" name="Picture 1"/>
+            <wp:cNvGraphicFramePr>
+              <a:graphicFrameLocks xmlns:a="http://schemas.openxmlformats.org/drawingml/2006/main" noChangeAspect="1"/>
+            </wp:cNvGraphicFramePr>
+            <a:graphic xmlns:a="http://schemas.openxmlformats.org/drawingml/2006/main">
+              <a:graphicData uri="http://schemas.openxmlformats.org/drawingml/2006/picture">
+                <pic:pic xmlns:pic="http://schemas.openxmlformats.org/drawingml/2006/picture">
+                  <pic:nvPicPr>
+                    <pic:cNvPr id="1964029956" name=""/>
+                    <pic:cNvPicPr/>
+                  </pic:nvPicPr>
+                  <pic:blipFill>
+                    <a:blip r:embed="rId6" cstate="print">
+                      <a:extLst>
+                        <a:ext uri="{28A0092B-C50C-407E-A947-70E740481C1C}">
+                          <a14:useLocalDpi xmlns:a14="http://schemas.microsoft.com/office/drawing/2010/main" val="0"/>
+                        </a:ext>
+                      </a:extLst>
+                    </a:blip>
+                    <a:stretch>
+                      <a:fillRect/>
+                    </a:stretch>
+                  </pic:blipFill>
+                  <pic:spPr>
+                    <a:xfrm>
+                      <a:off x="0" y="0"/>
+                      <a:ext cx="6645910" cy="3736975"/>
+                    </a:xfrm>
+                    <a:prstGeom prst="rect">
+                      <a:avLst/>
+                    </a:prstGeom>
+                  </pic:spPr>
+                </pic:pic>
+              </a:graphicData>
+            </a:graphic>
+          </wp:anchor>
+        </w:drawing>
+      </w:r>
+    </w:p>
+    <w:p/>
+    <w:p>
+      <w:pPr>
+        <w:pStyle w:val="Heading2"/>
+        <w:numPr>
+          <w:ilvl w:val="0"/>
+          <w:numId w:val="17"/>
+        </w:numPr>
+      </w:pPr>
+      <w:r>
+        <w:lastRenderedPageBreak/>
+        <w:drawing>
+          <wp:anchor distT="0" distB="0" distL="114300" distR="114300" simplePos="0" relativeHeight="251661312" behindDoc="1" locked="0" layoutInCell="1" allowOverlap="1" wp14:anchorId="4B6AEAA3" wp14:editId="20EF0972">
+            <wp:simplePos x="0" y="0"/>
+            <wp:positionH relativeFrom="column">
+              <wp:posOffset>165100</wp:posOffset>
+            </wp:positionH>
+            <wp:positionV relativeFrom="paragraph">
+              <wp:posOffset>358140</wp:posOffset>
+            </wp:positionV>
+            <wp:extent cx="6645910" cy="4665980"/>
+            <wp:effectExtent l="0" t="0" r="2540" b="1270"/>
+            <wp:wrapTight wrapText="bothSides">
+              <wp:wrapPolygon edited="0">
+                <wp:start x="0" y="0"/>
+                <wp:lineTo x="0" y="21518"/>
+                <wp:lineTo x="21546" y="21518"/>
+                <wp:lineTo x="21546" y="0"/>
+                <wp:lineTo x="0" y="0"/>
+              </wp:wrapPolygon>
+            </wp:wrapTight>
+            <wp:docPr id="1896666105" name="Picture 1"/>
+            <wp:cNvGraphicFramePr>
+              <a:graphicFrameLocks xmlns:a="http://schemas.openxmlformats.org/drawingml/2006/main" noChangeAspect="1"/>
+            </wp:cNvGraphicFramePr>
+            <a:graphic xmlns:a="http://schemas.openxmlformats.org/drawingml/2006/main">
+              <a:graphicData uri="http://schemas.openxmlformats.org/drawingml/2006/picture">
+                <pic:pic xmlns:pic="http://schemas.openxmlformats.org/drawingml/2006/picture">
+                  <pic:nvPicPr>
+                    <pic:cNvPr id="1896666105" name=""/>
+                    <pic:cNvPicPr/>
+                  </pic:nvPicPr>
+                  <pic:blipFill>
+                    <a:blip r:embed="rId7">
+                      <a:extLst>
+                        <a:ext uri="{28A0092B-C50C-407E-A947-70E740481C1C}">
+                          <a14:useLocalDpi xmlns:a14="http://schemas.microsoft.com/office/drawing/2010/main" val="0"/>
+                        </a:ext>
+                      </a:extLst>
+                    </a:blip>
+                    <a:stretch>
+                      <a:fillRect/>
+                    </a:stretch>
+                  </pic:blipFill>
+                  <pic:spPr>
+                    <a:xfrm>
+                      <a:off x="0" y="0"/>
+                      <a:ext cx="6645910" cy="4665980"/>
+                    </a:xfrm>
+                    <a:prstGeom prst="rect">
+                      <a:avLst/>
+                    </a:prstGeom>
+                  </pic:spPr>
+                </pic:pic>
+              </a:graphicData>
+            </a:graphic>
+          </wp:anchor>
+        </w:drawing>
+      </w:r>
+      <w:r>
+        <w:t xml:space="preserve">Get Vehicle </w:t>
+      </w:r>
+      <w:proofErr w:type="gramStart"/>
+      <w:r>
+        <w:t>By</w:t>
+      </w:r>
+      <w:proofErr w:type="gramEnd"/>
+      <w:r>
+        <w:t xml:space="preserve"> Id</w:t>
+      </w:r>
+    </w:p>
+    <w:p>
+      <w:pPr>
+        <w:pStyle w:val="Heading2"/>
+        <w:numPr>
+          <w:ilvl w:val="0"/>
+          <w:numId w:val="17"/>
+        </w:numPr>
+      </w:pPr>
+      <w:r>
+        <w:drawing>
+          <wp:anchor distT="0" distB="0" distL="114300" distR="114300" simplePos="0" relativeHeight="251662336" behindDoc="1" locked="0" layoutInCell="1" allowOverlap="1" wp14:anchorId="4A64C239" wp14:editId="61035038">
+            <wp:simplePos x="0" y="0"/>
+            <wp:positionH relativeFrom="column">
+              <wp:posOffset>228600</wp:posOffset>
+            </wp:positionH>
+            <wp:positionV relativeFrom="paragraph">
+              <wp:posOffset>5095240</wp:posOffset>
+            </wp:positionV>
+            <wp:extent cx="6621780" cy="3966845"/>
+            <wp:effectExtent l="0" t="0" r="7620" b="0"/>
+            <wp:wrapTight wrapText="bothSides">
+              <wp:wrapPolygon edited="0">
+                <wp:start x="0" y="0"/>
+                <wp:lineTo x="0" y="21472"/>
+                <wp:lineTo x="21563" y="21472"/>
+                <wp:lineTo x="21563" y="0"/>
+                <wp:lineTo x="0" y="0"/>
+              </wp:wrapPolygon>
+            </wp:wrapTight>
+            <wp:docPr id="1041177547" name="Picture 1"/>
+            <wp:cNvGraphicFramePr>
+              <a:graphicFrameLocks xmlns:a="http://schemas.openxmlformats.org/drawingml/2006/main" noChangeAspect="1"/>
+            </wp:cNvGraphicFramePr>
+            <a:graphic xmlns:a="http://schemas.openxmlformats.org/drawingml/2006/main">
+              <a:graphicData uri="http://schemas.openxmlformats.org/drawingml/2006/picture">
+                <pic:pic xmlns:pic="http://schemas.openxmlformats.org/drawingml/2006/picture">
+                  <pic:nvPicPr>
+                    <pic:cNvPr id="1041177547" name=""/>
+                    <pic:cNvPicPr/>
+                  </pic:nvPicPr>
+                  <pic:blipFill>
+                    <a:blip r:embed="rId8">
+                      <a:extLst>
+                        <a:ext uri="{28A0092B-C50C-407E-A947-70E740481C1C}">
+                          <a14:useLocalDpi xmlns:a14="http://schemas.microsoft.com/office/drawing/2010/main" val="0"/>
+                        </a:ext>
+                      </a:extLst>
+                    </a:blip>
+                    <a:stretch>
+                      <a:fillRect/>
+                    </a:stretch>
+                  </pic:blipFill>
+                  <pic:spPr>
+                    <a:xfrm>
+                      <a:off x="0" y="0"/>
+                      <a:ext cx="6621780" cy="3966845"/>
+                    </a:xfrm>
+                    <a:prstGeom prst="rect">
+                      <a:avLst/>
+                    </a:prstGeom>
+                  </pic:spPr>
+                </pic:pic>
+              </a:graphicData>
+            </a:graphic>
+            <wp14:sizeRelH relativeFrom="margin">
+              <wp14:pctWidth>0</wp14:pctWidth>
+            </wp14:sizeRelH>
+            <wp14:sizeRelV relativeFrom="margin">
+              <wp14:pctHeight>0</wp14:pctHeight>
+            </wp14:sizeRelV>
+          </wp:anchor>
+        </w:drawing>
+      </w:r>
+      <w:r>
+        <w:t xml:space="preserve">Delete Vehicle by Id </w:t>
+      </w:r>
+    </w:p>
+    <w:p/>
+    <w:p>
+      <w:pPr>
+        <w:pStyle w:val="Heading2"/>
+        <w:numPr>
+          <w:ilvl w:val="0"/>
+          <w:numId w:val="17"/>
+        </w:numPr>
+      </w:pPr>
+      <w:r>
+        <w:lastRenderedPageBreak/>
+        <w:t>Updating Vehicle Status by Id</w:t>
+      </w:r>
+      <w:r>
+        <w:tab/>
+      </w:r>
+      <w:r>
+        <w:br/>
+      </w:r>
+      <w:r>
+        <w:drawing>
+          <wp:inline distT="0" distB="0" distL="0" distR="0" wp14:anchorId="11235240" wp14:editId="42026768">
+            <wp:extent cx="6645910" cy="6217285"/>
+            <wp:effectExtent l="0" t="0" r="2540" b="0"/>
+            <wp:docPr id="214982454" name="Picture 1"/>
+            <wp:cNvGraphicFramePr>
+              <a:graphicFrameLocks xmlns:a="http://schemas.openxmlformats.org/drawingml/2006/main" noChangeAspect="1"/>
+            </wp:cNvGraphicFramePr>
+            <a:graphic xmlns:a="http://schemas.openxmlformats.org/drawingml/2006/main">
+              <a:graphicData uri="http://schemas.openxmlformats.org/drawingml/2006/picture">
+                <pic:pic xmlns:pic="http://schemas.openxmlformats.org/drawingml/2006/picture">
+                  <pic:nvPicPr>
+                    <pic:cNvPr id="214982454" name=""/>
+                    <pic:cNvPicPr/>
+                  </pic:nvPicPr>
+                  <pic:blipFill>
+                    <a:blip r:embed="rId9"/>
+                    <a:stretch>
+                      <a:fillRect/>
+                    </a:stretch>
+                  </pic:blipFill>
+                  <pic:spPr>
+                    <a:xfrm>
+                      <a:off x="0" y="0"/>
+                      <a:ext cx="6645910" cy="6217285"/>
+                    </a:xfrm>
+                    <a:prstGeom prst="rect">
+                      <a:avLst/>
+                    </a:prstGeom>
+                  </pic:spPr>
+                </pic:pic>
+              </a:graphicData>
+            </a:graphic>
+          </wp:inline>
+        </w:drawing>
+      </w:r>
     </w:p>
     <w:sectPr>
       <w:pgSz w:w="11906" w:h="16838"/>
@@ -2398,7 +2766,7 @@
   <w:abstractNum w:abstractNumId="1" w15:restartNumberingAfterBreak="0">
     <w:nsid w:val="0F94547D"/>
     <w:multiLevelType w:val="hybridMultilevel"/>
-    <w:tmpl w:val="5E16EFB8"/>
+    <w:tmpl w:val="9B8E1858"/>
     <w:lvl w:ilvl="0" w:tplc="4009000F">
       <w:start w:val="1"/>
       <w:numFmt w:val="decimal"/>
@@ -2417,7 +2785,7 @@
         <w:ind w:left="1080" w:hanging="360"/>
       </w:pPr>
     </w:lvl>
-    <w:lvl w:ilvl="2" w:tplc="4009001B" w:tentative="1">
+    <w:lvl w:ilvl="2" w:tplc="4009001B">
       <w:start w:val="1"/>
       <w:numFmt w:val="lowerRoman"/>
       <w:lvlText w:val="%3."/>
@@ -2780,6 +3148,92 @@
     </w:lvl>
   </w:abstractNum>
   <w:abstractNum w:abstractNumId="4" w15:restartNumberingAfterBreak="0">
+    <w:nsid w:val="286F68A1"/>
+    <w:multiLevelType w:val="hybridMultilevel"/>
+    <w:tmpl w:val="38FC8F86"/>
+    <w:lvl w:ilvl="0" w:tplc="4009000F">
+      <w:start w:val="1"/>
+      <w:numFmt w:val="decimal"/>
+      <w:lvlText w:val="%1."/>
+      <w:lvlJc w:val="left"/>
+      <w:pPr>
+        <w:ind w:left="1080" w:hanging="360"/>
+      </w:pPr>
+    </w:lvl>
+    <w:lvl w:ilvl="1" w:tplc="FFFFFFFF">
+      <w:start w:val="1"/>
+      <w:numFmt w:val="lowerLetter"/>
+      <w:lvlText w:val="%2)"/>
+      <w:lvlJc w:val="left"/>
+      <w:pPr>
+        <w:ind w:left="1800" w:hanging="360"/>
+      </w:pPr>
+    </w:lvl>
+    <w:lvl w:ilvl="2" w:tplc="FFFFFFFF">
+      <w:start w:val="1"/>
+      <w:numFmt w:val="lowerRoman"/>
+      <w:lvlText w:val="%3."/>
+      <w:lvlJc w:val="right"/>
+      <w:pPr>
+        <w:ind w:left="2520" w:hanging="180"/>
+      </w:pPr>
+    </w:lvl>
+    <w:lvl w:ilvl="3" w:tplc="FFFFFFFF" w:tentative="1">
+      <w:start w:val="1"/>
+      <w:numFmt w:val="decimal"/>
+      <w:lvlText w:val="%4."/>
+      <w:lvlJc w:val="left"/>
+      <w:pPr>
+        <w:ind w:left="3240" w:hanging="360"/>
+      </w:pPr>
+    </w:lvl>
+    <w:lvl w:ilvl="4" w:tplc="FFFFFFFF" w:tentative="1">
+      <w:start w:val="1"/>
+      <w:numFmt w:val="lowerLetter"/>
+      <w:lvlText w:val="%5."/>
+      <w:lvlJc w:val="left"/>
+      <w:pPr>
+        <w:ind w:left="3960" w:hanging="360"/>
+      </w:pPr>
+    </w:lvl>
+    <w:lvl w:ilvl="5" w:tplc="FFFFFFFF" w:tentative="1">
+      <w:start w:val="1"/>
+      <w:numFmt w:val="lowerRoman"/>
+      <w:lvlText w:val="%6."/>
+      <w:lvlJc w:val="right"/>
+      <w:pPr>
+        <w:ind w:left="4680" w:hanging="180"/>
+      </w:pPr>
+    </w:lvl>
+    <w:lvl w:ilvl="6" w:tplc="FFFFFFFF" w:tentative="1">
+      <w:start w:val="1"/>
+      <w:numFmt w:val="decimal"/>
+      <w:lvlText w:val="%7."/>
+      <w:lvlJc w:val="left"/>
+      <w:pPr>
+        <w:ind w:left="5400" w:hanging="360"/>
+      </w:pPr>
+    </w:lvl>
+    <w:lvl w:ilvl="7" w:tplc="FFFFFFFF" w:tentative="1">
+      <w:start w:val="1"/>
+      <w:numFmt w:val="lowerLetter"/>
+      <w:lvlText w:val="%8."/>
+      <w:lvlJc w:val="left"/>
+      <w:pPr>
+        <w:ind w:left="6120" w:hanging="360"/>
+      </w:pPr>
+    </w:lvl>
+    <w:lvl w:ilvl="8" w:tplc="FFFFFFFF" w:tentative="1">
+      <w:start w:val="1"/>
+      <w:numFmt w:val="lowerRoman"/>
+      <w:lvlText w:val="%9."/>
+      <w:lvlJc w:val="right"/>
+      <w:pPr>
+        <w:ind w:left="6840" w:hanging="180"/>
+      </w:pPr>
+    </w:lvl>
+  </w:abstractNum>
+  <w:abstractNum w:abstractNumId="5" w15:restartNumberingAfterBreak="0">
     <w:nsid w:val="2CFE3C3C"/>
     <w:multiLevelType w:val="hybridMultilevel"/>
     <w:tmpl w:val="1354D666"/>
@@ -2865,7 +3319,7 @@
       </w:pPr>
     </w:lvl>
   </w:abstractNum>
-  <w:abstractNum w:abstractNumId="5" w15:restartNumberingAfterBreak="0">
+  <w:abstractNum w:abstractNumId="6" w15:restartNumberingAfterBreak="0">
     <w:nsid w:val="430E24DC"/>
     <w:multiLevelType w:val="multilevel"/>
     <w:tmpl w:val="957057F2"/>
@@ -3014,7 +3468,7 @@
       </w:rPr>
     </w:lvl>
   </w:abstractNum>
-  <w:abstractNum w:abstractNumId="6" w15:restartNumberingAfterBreak="0">
+  <w:abstractNum w:abstractNumId="7" w15:restartNumberingAfterBreak="0">
     <w:nsid w:val="48E6664B"/>
     <w:multiLevelType w:val="hybridMultilevel"/>
     <w:tmpl w:val="5180EBCA"/>
@@ -3100,7 +3554,7 @@
       </w:pPr>
     </w:lvl>
   </w:abstractNum>
-  <w:abstractNum w:abstractNumId="7" w15:restartNumberingAfterBreak="0">
+  <w:abstractNum w:abstractNumId="8" w15:restartNumberingAfterBreak="0">
     <w:nsid w:val="53AD5EE9"/>
     <w:multiLevelType w:val="multilevel"/>
     <w:tmpl w:val="957057F2"/>
@@ -3249,7 +3703,7 @@
       </w:rPr>
     </w:lvl>
   </w:abstractNum>
-  <w:abstractNum w:abstractNumId="8" w15:restartNumberingAfterBreak="0">
+  <w:abstractNum w:abstractNumId="9" w15:restartNumberingAfterBreak="0">
     <w:nsid w:val="5D7F188C"/>
     <w:multiLevelType w:val="multilevel"/>
     <w:tmpl w:val="957057F2"/>
@@ -3398,7 +3852,7 @@
       </w:rPr>
     </w:lvl>
   </w:abstractNum>
-  <w:abstractNum w:abstractNumId="9" w15:restartNumberingAfterBreak="0">
+  <w:abstractNum w:abstractNumId="10" w15:restartNumberingAfterBreak="0">
     <w:nsid w:val="60C408A0"/>
     <w:multiLevelType w:val="hybridMultilevel"/>
     <w:tmpl w:val="0400EBB6"/>
@@ -3484,7 +3938,7 @@
       </w:pPr>
     </w:lvl>
   </w:abstractNum>
-  <w:abstractNum w:abstractNumId="10" w15:restartNumberingAfterBreak="0">
+  <w:abstractNum w:abstractNumId="11" w15:restartNumberingAfterBreak="0">
     <w:nsid w:val="65E24C41"/>
     <w:multiLevelType w:val="multilevel"/>
     <w:tmpl w:val="957057F2"/>
@@ -3633,7 +4087,7 @@
       </w:rPr>
     </w:lvl>
   </w:abstractNum>
-  <w:abstractNum w:abstractNumId="11" w15:restartNumberingAfterBreak="0">
+  <w:abstractNum w:abstractNumId="12" w15:restartNumberingAfterBreak="0">
     <w:nsid w:val="67E21030"/>
     <w:multiLevelType w:val="multilevel"/>
     <w:tmpl w:val="957057F2"/>
@@ -3782,7 +4236,7 @@
       </w:rPr>
     </w:lvl>
   </w:abstractNum>
-  <w:abstractNum w:abstractNumId="12" w15:restartNumberingAfterBreak="0">
+  <w:abstractNum w:abstractNumId="13" w15:restartNumberingAfterBreak="0">
     <w:nsid w:val="689A1716"/>
     <w:multiLevelType w:val="multilevel"/>
     <w:tmpl w:val="957057F2"/>
@@ -3931,7 +4385,7 @@
       </w:rPr>
     </w:lvl>
   </w:abstractNum>
-  <w:abstractNum w:abstractNumId="13" w15:restartNumberingAfterBreak="0">
+  <w:abstractNum w:abstractNumId="14" w15:restartNumberingAfterBreak="0">
     <w:nsid w:val="6E3410D5"/>
     <w:multiLevelType w:val="multilevel"/>
     <w:tmpl w:val="957057F2"/>
@@ -4080,7 +4534,7 @@
       </w:rPr>
     </w:lvl>
   </w:abstractNum>
-  <w:abstractNum w:abstractNumId="14" w15:restartNumberingAfterBreak="0">
+  <w:abstractNum w:abstractNumId="15" w15:restartNumberingAfterBreak="0">
     <w:nsid w:val="7B511DA4"/>
     <w:multiLevelType w:val="multilevel"/>
     <w:tmpl w:val="957057F2"/>
@@ -4229,7 +4683,7 @@
       </w:rPr>
     </w:lvl>
   </w:abstractNum>
-  <w:abstractNum w:abstractNumId="15" w15:restartNumberingAfterBreak="0">
+  <w:abstractNum w:abstractNumId="16" w15:restartNumberingAfterBreak="0">
     <w:nsid w:val="7C301635"/>
     <w:multiLevelType w:val="multilevel"/>
     <w:tmpl w:val="957057F2"/>
@@ -4382,10 +4836,10 @@
     <w:abstractNumId w:val="1"/>
   </w:num>
   <w:num w:numId="2" w16cid:durableId="84424843">
-    <w:abstractNumId w:val="9"/>
+    <w:abstractNumId w:val="10"/>
   </w:num>
   <w:num w:numId="3" w16cid:durableId="941499101">
-    <w:abstractNumId w:val="4"/>
+    <w:abstractNumId w:val="5"/>
   </w:num>
   <w:num w:numId="4" w16cid:durableId="957494722">
     <w:abstractNumId w:val="0"/>
@@ -4394,37 +4848,40 @@
     <w:abstractNumId w:val="3"/>
   </w:num>
   <w:num w:numId="6" w16cid:durableId="440421771">
+    <w:abstractNumId w:val="15"/>
+  </w:num>
+  <w:num w:numId="7" w16cid:durableId="82845095">
+    <w:abstractNumId w:val="7"/>
+  </w:num>
+  <w:num w:numId="8" w16cid:durableId="407271444">
     <w:abstractNumId w:val="14"/>
   </w:num>
-  <w:num w:numId="7" w16cid:durableId="82845095">
-    <w:abstractNumId w:val="6"/>
-  </w:num>
-  <w:num w:numId="8" w16cid:durableId="407271444">
-    <w:abstractNumId w:val="13"/>
-  </w:num>
   <w:num w:numId="9" w16cid:durableId="254290087">
-    <w:abstractNumId w:val="10"/>
+    <w:abstractNumId w:val="11"/>
   </w:num>
   <w:num w:numId="10" w16cid:durableId="1514614470">
     <w:abstractNumId w:val="2"/>
   </w:num>
   <w:num w:numId="11" w16cid:durableId="635526246">
-    <w:abstractNumId w:val="15"/>
+    <w:abstractNumId w:val="16"/>
   </w:num>
   <w:num w:numId="12" w16cid:durableId="1802068683">
-    <w:abstractNumId w:val="7"/>
+    <w:abstractNumId w:val="8"/>
   </w:num>
   <w:num w:numId="13" w16cid:durableId="950164681">
-    <w:abstractNumId w:val="5"/>
+    <w:abstractNumId w:val="6"/>
   </w:num>
   <w:num w:numId="14" w16cid:durableId="724523640">
-    <w:abstractNumId w:val="11"/>
+    <w:abstractNumId w:val="12"/>
   </w:num>
   <w:num w:numId="15" w16cid:durableId="1704133112">
-    <w:abstractNumId w:val="12"/>
+    <w:abstractNumId w:val="13"/>
   </w:num>
   <w:num w:numId="16" w16cid:durableId="1654945802">
-    <w:abstractNumId w:val="8"/>
+    <w:abstractNumId w:val="9"/>
+  </w:num>
+  <w:num w:numId="17" w16cid:durableId="1152602124">
+    <w:abstractNumId w:val="4"/>
   </w:num>
 </w:numbering>
 </file>

</xml_diff>